<commit_message>
Add Review 2 algorithms, flowcharts, and patent document
</commit_message>
<xml_diff>
--- a/Secure OTA.docx
+++ b/Secure OTA.docx
@@ -4,523 +4,6 @@
   <w:body>
     <w:p>
       <w:pPr>
-        <w:spacing w:line="360" w:lineRule="auto"/>
-        <w:jc w:val="center"/>
-        <w:rPr>
-          <w:rFonts w:ascii="Times New Roman" w:eastAsiaTheme="majorEastAsia" w:hAnsi="Times New Roman" w:cs="Times New Roman"/>
-          <w:b/>
-          <w:bCs/>
-          <w:spacing w:val="-10"/>
-          <w:kern w:val="28"/>
-        </w:rPr>
-      </w:pPr>
-      <w:r>
-        <w:rPr>
-          <w:rFonts w:ascii="Times New Roman" w:eastAsiaTheme="majorEastAsia" w:hAnsi="Times New Roman" w:cs="Times New Roman"/>
-          <w:b/>
-          <w:bCs/>
-          <w:noProof/>
-          <w:spacing w:val="-10"/>
-          <w:kern w:val="28"/>
-          <w:lang w:val="en-US" w:eastAsia="en-US"/>
-        </w:rPr>
-        <w:drawing>
-          <wp:inline distT="0" distB="0" distL="0" distR="0" wp14:anchorId="0CF333FA" wp14:editId="691DC141">
-            <wp:extent cx="3162300" cy="1059180"/>
-            <wp:effectExtent l="0" t="0" r="0" b="7620"/>
-            <wp:docPr id="1084707302" name="Picture 2"/>
-            <wp:cNvGraphicFramePr>
-              <a:graphicFrameLocks xmlns:a="http://schemas.openxmlformats.org/drawingml/2006/main" noChangeAspect="1"/>
-            </wp:cNvGraphicFramePr>
-            <a:graphic xmlns:a="http://schemas.openxmlformats.org/drawingml/2006/main">
-              <a:graphicData uri="http://schemas.openxmlformats.org/drawingml/2006/picture">
-                <pic:pic xmlns:pic="http://schemas.openxmlformats.org/drawingml/2006/picture">
-                  <pic:nvPicPr>
-                    <pic:cNvPr id="0" name="Picture 6"/>
-                    <pic:cNvPicPr>
-                      <a:picLocks noChangeAspect="1" noChangeArrowheads="1"/>
-                    </pic:cNvPicPr>
-                  </pic:nvPicPr>
-                  <pic:blipFill>
-                    <a:blip r:embed="rId8">
-                      <a:extLst>
-                        <a:ext uri="{28A0092B-C50C-407E-A947-70E740481C1C}">
-                          <a14:useLocalDpi xmlns:a14="http://schemas.microsoft.com/office/drawing/2010/main" val="0"/>
-                        </a:ext>
-                      </a:extLst>
-                    </a:blip>
-                    <a:srcRect/>
-                    <a:stretch>
-                      <a:fillRect/>
-                    </a:stretch>
-                  </pic:blipFill>
-                  <pic:spPr bwMode="auto">
-                    <a:xfrm>
-                      <a:off x="0" y="0"/>
-                      <a:ext cx="3162300" cy="1059180"/>
-                    </a:xfrm>
-                    <a:prstGeom prst="rect">
-                      <a:avLst/>
-                    </a:prstGeom>
-                    <a:noFill/>
-                    <a:ln>
-                      <a:noFill/>
-                    </a:ln>
-                  </pic:spPr>
-                </pic:pic>
-              </a:graphicData>
-            </a:graphic>
-          </wp:inline>
-        </w:drawing>
-      </w:r>
-    </w:p>
-    <w:p>
-      <w:pPr>
-        <w:spacing w:line="360" w:lineRule="auto"/>
-        <w:jc w:val="center"/>
-        <w:rPr>
-          <w:rFonts w:ascii="Times New Roman" w:eastAsiaTheme="majorEastAsia" w:hAnsi="Times New Roman" w:cs="Times New Roman"/>
-          <w:b/>
-          <w:bCs/>
-          <w:spacing w:val="-10"/>
-          <w:kern w:val="28"/>
-        </w:rPr>
-      </w:pPr>
-    </w:p>
-    <w:p>
-      <w:pPr>
-        <w:spacing w:after="375" w:line="360" w:lineRule="auto"/>
-        <w:ind w:left="371" w:hanging="7"/>
-        <w:jc w:val="center"/>
-        <w:rPr>
-          <w:rFonts w:ascii="Times New Roman" w:eastAsia="Times New Roman" w:hAnsi="Times New Roman" w:cs="Times New Roman"/>
-          <w:b/>
-          <w:sz w:val="40"/>
-          <w:szCs w:val="40"/>
-        </w:rPr>
-      </w:pPr>
-      <w:r>
-        <w:rPr>
-          <w:rFonts w:ascii="Times New Roman" w:eastAsia="Times New Roman" w:hAnsi="Times New Roman" w:cs="Times New Roman"/>
-          <w:b/>
-          <w:sz w:val="40"/>
-          <w:szCs w:val="40"/>
-        </w:rPr>
-        <w:t>SECURE</w:t>
-      </w:r>
-      <w:r>
-        <w:rPr>
-          <w:rFonts w:ascii="Times New Roman" w:eastAsia="Times New Roman" w:hAnsi="Times New Roman" w:cs="Times New Roman"/>
-          <w:b/>
-          <w:sz w:val="40"/>
-          <w:szCs w:val="40"/>
-        </w:rPr>
-        <w:t xml:space="preserve"> HETROGENEOUS</w:t>
-      </w:r>
-      <w:r>
-        <w:rPr>
-          <w:rFonts w:ascii="Times New Roman" w:eastAsia="Times New Roman" w:hAnsi="Times New Roman" w:cs="Times New Roman"/>
-          <w:b/>
-          <w:sz w:val="40"/>
-          <w:szCs w:val="40"/>
-        </w:rPr>
-        <w:t xml:space="preserve"> OVER-THE-AIR (OTA) FIRMWARE UPDATE MECHANISM FOR IOT DEVICES</w:t>
-      </w:r>
-    </w:p>
-    <w:p>
-      <w:pPr>
-        <w:spacing w:after="375" w:line="360" w:lineRule="auto"/>
-        <w:ind w:left="371" w:hanging="7"/>
-        <w:jc w:val="center"/>
-        <w:rPr>
-          <w:rFonts w:ascii="Times New Roman" w:eastAsia="Times New Roman" w:hAnsi="Times New Roman" w:cs="Times New Roman"/>
-          <w:b/>
-          <w:sz w:val="32"/>
-          <w:szCs w:val="32"/>
-        </w:rPr>
-      </w:pPr>
-      <w:r>
-        <w:rPr>
-          <w:rFonts w:ascii="Times New Roman" w:eastAsia="Times New Roman" w:hAnsi="Times New Roman" w:cs="Times New Roman"/>
-          <w:b/>
-          <w:sz w:val="32"/>
-          <w:szCs w:val="32"/>
-        </w:rPr>
-        <w:t xml:space="preserve">PROJECT </w:t>
-      </w:r>
-      <w:r>
-        <w:rPr>
-          <w:rFonts w:ascii="Times New Roman" w:eastAsia="Times New Roman" w:hAnsi="Times New Roman" w:cs="Times New Roman"/>
-          <w:b/>
-          <w:sz w:val="32"/>
-          <w:szCs w:val="32"/>
-        </w:rPr>
-        <w:t xml:space="preserve">REPORT </w:t>
-      </w:r>
-    </w:p>
-    <w:p>
-      <w:pPr>
-        <w:spacing w:line="360" w:lineRule="auto"/>
-        <w:jc w:val="center"/>
-        <w:rPr>
-          <w:rFonts w:ascii="Times New Roman" w:eastAsiaTheme="majorEastAsia" w:hAnsi="Times New Roman" w:cs="Times New Roman"/>
-          <w:b/>
-          <w:bCs/>
-          <w:spacing w:val="-10"/>
-          <w:kern w:val="28"/>
-          <w:sz w:val="32"/>
-          <w:szCs w:val="32"/>
-        </w:rPr>
-      </w:pPr>
-      <w:r>
-        <w:rPr>
-          <w:rFonts w:ascii="Times New Roman" w:eastAsiaTheme="majorEastAsia" w:hAnsi="Times New Roman" w:cs="Times New Roman"/>
-          <w:b/>
-          <w:bCs/>
-          <w:i/>
-          <w:iCs/>
-          <w:spacing w:val="-10"/>
-          <w:kern w:val="28"/>
-          <w:sz w:val="32"/>
-          <w:szCs w:val="32"/>
-        </w:rPr>
-        <w:t>Submitted by</w:t>
-      </w:r>
-    </w:p>
-    <w:p>
-      <w:pPr>
-        <w:spacing w:line="360" w:lineRule="auto"/>
-        <w:jc w:val="center"/>
-        <w:rPr>
-          <w:rFonts w:ascii="Times New Roman" w:eastAsiaTheme="majorEastAsia" w:hAnsi="Times New Roman" w:cs="Times New Roman"/>
-          <w:b/>
-          <w:bCs/>
-          <w:spacing w:val="-10"/>
-          <w:kern w:val="28"/>
-          <w:sz w:val="32"/>
-          <w:szCs w:val="32"/>
-        </w:rPr>
-      </w:pPr>
-    </w:p>
-    <w:p>
-      <w:pPr>
-        <w:spacing w:line="360" w:lineRule="auto"/>
-        <w:jc w:val="center"/>
-        <w:rPr>
-          <w:rFonts w:ascii="Times New Roman" w:eastAsiaTheme="majorEastAsia" w:hAnsi="Times New Roman" w:cs="Times New Roman"/>
-          <w:b/>
-          <w:bCs/>
-          <w:spacing w:val="-10"/>
-          <w:kern w:val="28"/>
-          <w:sz w:val="32"/>
-          <w:szCs w:val="32"/>
-        </w:rPr>
-      </w:pPr>
-      <w:r>
-        <w:rPr>
-          <w:rFonts w:ascii="Times New Roman" w:eastAsiaTheme="majorEastAsia" w:hAnsi="Times New Roman" w:cs="Times New Roman"/>
-          <w:b/>
-          <w:bCs/>
-          <w:spacing w:val="-10"/>
-          <w:kern w:val="28"/>
-          <w:sz w:val="32"/>
-          <w:szCs w:val="32"/>
-        </w:rPr>
-        <w:t>RITESH V</w:t>
-      </w:r>
-      <w:r>
-        <w:rPr>
-          <w:rFonts w:ascii="Times New Roman" w:eastAsiaTheme="majorEastAsia" w:hAnsi="Times New Roman" w:cs="Times New Roman"/>
-          <w:b/>
-          <w:bCs/>
-          <w:spacing w:val="-10"/>
-          <w:kern w:val="28"/>
-          <w:sz w:val="32"/>
-          <w:szCs w:val="32"/>
-        </w:rPr>
-        <w:t xml:space="preserve"> </w:t>
-      </w:r>
-      <w:r>
-        <w:rPr>
-          <w:rFonts w:ascii="Times New Roman" w:eastAsiaTheme="majorEastAsia" w:hAnsi="Times New Roman" w:cs="Times New Roman"/>
-          <w:b/>
-          <w:bCs/>
-          <w:spacing w:val="-10"/>
-          <w:kern w:val="28"/>
-          <w:sz w:val="32"/>
-          <w:szCs w:val="32"/>
-        </w:rPr>
-        <w:t>–</w:t>
-      </w:r>
-      <w:r>
-        <w:rPr>
-          <w:rFonts w:ascii="Times New Roman" w:eastAsiaTheme="majorEastAsia" w:hAnsi="Times New Roman" w:cs="Times New Roman"/>
-          <w:b/>
-          <w:bCs/>
-          <w:spacing w:val="-10"/>
-          <w:kern w:val="28"/>
-          <w:sz w:val="32"/>
-          <w:szCs w:val="32"/>
-        </w:rPr>
-        <w:t xml:space="preserve"> 91231280</w:t>
-      </w:r>
-      <w:r>
-        <w:rPr>
-          <w:rFonts w:ascii="Times New Roman" w:eastAsiaTheme="majorEastAsia" w:hAnsi="Times New Roman" w:cs="Times New Roman"/>
-          <w:b/>
-          <w:bCs/>
-          <w:spacing w:val="-10"/>
-          <w:kern w:val="28"/>
-          <w:sz w:val="32"/>
-          <w:szCs w:val="32"/>
-        </w:rPr>
-        <w:t>39</w:t>
-      </w:r>
-    </w:p>
-    <w:p>
-      <w:pPr>
-        <w:spacing w:line="360" w:lineRule="auto"/>
-        <w:jc w:val="center"/>
-        <w:rPr>
-          <w:rFonts w:ascii="Times New Roman" w:eastAsiaTheme="majorEastAsia" w:hAnsi="Times New Roman" w:cs="Times New Roman"/>
-          <w:b/>
-          <w:bCs/>
-          <w:spacing w:val="-10"/>
-          <w:kern w:val="28"/>
-          <w:sz w:val="32"/>
-          <w:szCs w:val="32"/>
-        </w:rPr>
-      </w:pPr>
-      <w:r>
-        <w:rPr>
-          <w:rFonts w:ascii="Times New Roman" w:eastAsiaTheme="majorEastAsia" w:hAnsi="Times New Roman" w:cs="Times New Roman"/>
-          <w:b/>
-          <w:bCs/>
-          <w:spacing w:val="-10"/>
-          <w:kern w:val="28"/>
-          <w:sz w:val="32"/>
-          <w:szCs w:val="32"/>
-        </w:rPr>
-        <w:t>RITHIK SHARMA A  - 9123128040</w:t>
-      </w:r>
-    </w:p>
-    <w:p>
-      <w:pPr>
-        <w:spacing w:line="360" w:lineRule="auto"/>
-        <w:jc w:val="center"/>
-        <w:rPr>
-          <w:rFonts w:ascii="Times New Roman" w:eastAsiaTheme="majorEastAsia" w:hAnsi="Times New Roman" w:cs="Times New Roman"/>
-          <w:b/>
-          <w:bCs/>
-          <w:spacing w:val="-10"/>
-          <w:kern w:val="28"/>
-          <w:sz w:val="32"/>
-          <w:szCs w:val="32"/>
-        </w:rPr>
-      </w:pPr>
-      <w:r>
-        <w:rPr>
-          <w:rFonts w:ascii="Times New Roman" w:eastAsiaTheme="majorEastAsia" w:hAnsi="Times New Roman" w:cs="Times New Roman"/>
-          <w:b/>
-          <w:bCs/>
-          <w:spacing w:val="-10"/>
-          <w:kern w:val="28"/>
-          <w:sz w:val="32"/>
-          <w:szCs w:val="32"/>
-        </w:rPr>
-        <w:t>PRIYANKA DEVI S - 9123128034</w:t>
-      </w:r>
-    </w:p>
-    <w:p>
-      <w:pPr>
-        <w:spacing w:line="360" w:lineRule="auto"/>
-        <w:jc w:val="center"/>
-        <w:rPr>
-          <w:rFonts w:ascii="Times New Roman" w:eastAsiaTheme="majorEastAsia" w:hAnsi="Times New Roman" w:cs="Times New Roman"/>
-          <w:b/>
-          <w:bCs/>
-          <w:i/>
-          <w:iCs/>
-          <w:spacing w:val="-10"/>
-          <w:kern w:val="28"/>
-          <w:sz w:val="32"/>
-          <w:szCs w:val="32"/>
-        </w:rPr>
-      </w:pPr>
-      <w:r>
-        <w:rPr>
-          <w:rFonts w:ascii="Times New Roman" w:eastAsiaTheme="majorEastAsia" w:hAnsi="Times New Roman" w:cs="Times New Roman"/>
-          <w:b/>
-          <w:bCs/>
-          <w:i/>
-          <w:iCs/>
-          <w:spacing w:val="-10"/>
-          <w:kern w:val="28"/>
-          <w:sz w:val="32"/>
-          <w:szCs w:val="32"/>
-        </w:rPr>
-        <w:t xml:space="preserve">in the partial fulfilment for the award of the degree </w:t>
-      </w:r>
-    </w:p>
-    <w:p>
-      <w:pPr>
-        <w:spacing w:line="360" w:lineRule="auto"/>
-        <w:jc w:val="center"/>
-        <w:rPr>
-          <w:rFonts w:ascii="Times New Roman" w:eastAsiaTheme="majorEastAsia" w:hAnsi="Times New Roman" w:cs="Times New Roman"/>
-          <w:b/>
-          <w:bCs/>
-          <w:i/>
-          <w:iCs/>
-          <w:spacing w:val="-10"/>
-          <w:kern w:val="28"/>
-          <w:sz w:val="32"/>
-          <w:szCs w:val="32"/>
-        </w:rPr>
-      </w:pPr>
-      <w:r>
-        <w:rPr>
-          <w:rFonts w:ascii="Times New Roman" w:eastAsiaTheme="majorEastAsia" w:hAnsi="Times New Roman" w:cs="Times New Roman"/>
-          <w:b/>
-          <w:bCs/>
-          <w:i/>
-          <w:iCs/>
-          <w:spacing w:val="-10"/>
-          <w:kern w:val="28"/>
-          <w:sz w:val="32"/>
-          <w:szCs w:val="32"/>
-        </w:rPr>
-        <w:t>of</w:t>
-      </w:r>
-    </w:p>
-    <w:p>
-      <w:pPr>
-        <w:spacing w:line="360" w:lineRule="auto"/>
-        <w:jc w:val="center"/>
-        <w:rPr>
-          <w:rFonts w:ascii="Times New Roman" w:eastAsiaTheme="majorEastAsia" w:hAnsi="Times New Roman" w:cs="Times New Roman"/>
-          <w:b/>
-          <w:bCs/>
-          <w:spacing w:val="-10"/>
-          <w:kern w:val="28"/>
-          <w:sz w:val="32"/>
-          <w:szCs w:val="32"/>
-        </w:rPr>
-      </w:pPr>
-      <w:r>
-        <w:rPr>
-          <w:rFonts w:ascii="Times New Roman" w:eastAsiaTheme="majorEastAsia" w:hAnsi="Times New Roman" w:cs="Times New Roman"/>
-          <w:b/>
-          <w:bCs/>
-          <w:spacing w:val="-10"/>
-          <w:kern w:val="28"/>
-          <w:sz w:val="32"/>
-          <w:szCs w:val="32"/>
-        </w:rPr>
-        <w:t>BACHELOR OF ENGINEERING</w:t>
-      </w:r>
-    </w:p>
-    <w:p>
-      <w:pPr>
-        <w:spacing w:line="360" w:lineRule="auto"/>
-        <w:jc w:val="center"/>
-        <w:rPr>
-          <w:rFonts w:ascii="Times New Roman" w:eastAsiaTheme="majorEastAsia" w:hAnsi="Times New Roman" w:cs="Times New Roman"/>
-          <w:b/>
-          <w:bCs/>
-          <w:spacing w:val="-10"/>
-          <w:kern w:val="28"/>
-          <w:sz w:val="32"/>
-          <w:szCs w:val="32"/>
-        </w:rPr>
-      </w:pPr>
-      <w:r>
-        <w:rPr>
-          <w:rFonts w:ascii="Times New Roman" w:eastAsiaTheme="majorEastAsia" w:hAnsi="Times New Roman" w:cs="Times New Roman"/>
-          <w:b/>
-          <w:bCs/>
-          <w:spacing w:val="-10"/>
-          <w:kern w:val="28"/>
-          <w:sz w:val="32"/>
-          <w:szCs w:val="32"/>
-        </w:rPr>
-        <w:t>IN</w:t>
-      </w:r>
-    </w:p>
-    <w:p>
-      <w:pPr>
-        <w:spacing w:line="360" w:lineRule="auto"/>
-        <w:jc w:val="center"/>
-        <w:rPr>
-          <w:rFonts w:ascii="Times New Roman" w:eastAsiaTheme="majorEastAsia" w:hAnsi="Times New Roman" w:cs="Times New Roman"/>
-          <w:b/>
-          <w:bCs/>
-          <w:spacing w:val="-10"/>
-          <w:kern w:val="28"/>
-          <w:sz w:val="28"/>
-          <w:szCs w:val="28"/>
-        </w:rPr>
-      </w:pPr>
-      <w:r>
-        <w:rPr>
-          <w:rFonts w:ascii="Times New Roman" w:eastAsiaTheme="majorEastAsia" w:hAnsi="Times New Roman" w:cs="Times New Roman"/>
-          <w:b/>
-          <w:bCs/>
-          <w:spacing w:val="-10"/>
-          <w:kern w:val="28"/>
-          <w:sz w:val="28"/>
-          <w:szCs w:val="28"/>
-        </w:rPr>
-        <w:t>COMPUTER SCIENCE AND ENGINEERING (CYBER SECURITY)</w:t>
-      </w:r>
-    </w:p>
-    <w:p>
-      <w:pPr>
-        <w:spacing w:line="360" w:lineRule="auto"/>
-        <w:jc w:val="center"/>
-        <w:rPr>
-          <w:rFonts w:ascii="Times New Roman" w:eastAsiaTheme="majorEastAsia" w:hAnsi="Times New Roman" w:cs="Times New Roman"/>
-          <w:b/>
-          <w:bCs/>
-          <w:spacing w:val="-10"/>
-          <w:kern w:val="28"/>
-          <w:sz w:val="28"/>
-          <w:szCs w:val="28"/>
-        </w:rPr>
-      </w:pPr>
-      <w:r>
-        <w:rPr>
-          <w:rFonts w:ascii="Times New Roman" w:eastAsiaTheme="majorEastAsia" w:hAnsi="Times New Roman" w:cs="Times New Roman"/>
-          <w:b/>
-          <w:bCs/>
-          <w:spacing w:val="-10"/>
-          <w:kern w:val="28"/>
-          <w:sz w:val="28"/>
-          <w:szCs w:val="28"/>
-        </w:rPr>
-        <w:t>KCG COLLEGE OF TECHNOLOGY</w:t>
-      </w:r>
-    </w:p>
-    <w:p>
-      <w:pPr>
-        <w:jc w:val="center"/>
-        <w:rPr>
-          <w:rFonts w:ascii="Times New Roman" w:hAnsi="Times New Roman" w:cs="Times New Roman"/>
-          <w:sz w:val="28"/>
-          <w:szCs w:val="28"/>
-        </w:rPr>
-      </w:pPr>
-      <w:r>
-        <w:rPr>
-          <w:rFonts w:ascii="Times New Roman" w:hAnsi="Times New Roman" w:cs="Times New Roman"/>
-          <w:sz w:val="28"/>
-          <w:szCs w:val="28"/>
-        </w:rPr>
-        <w:t>KARAPAKKAM , CHENNAI 600097</w:t>
-      </w:r>
-    </w:p>
-    <w:p>
-      <w:pPr>
         <w:spacing w:before="120" w:after="120" w:line="360" w:lineRule="auto"/>
         <w:jc w:val="center"/>
         <w:rPr>
@@ -531,16 +14,19 @@
           <w:szCs w:val="44"/>
         </w:rPr>
       </w:pPr>
-      <w:r>
-        <w:rPr>
-          <w:rFonts w:ascii="Times New Roman" w:eastAsiaTheme="majorEastAsia" w:hAnsi="Times New Roman" w:cs="Times New Roman"/>
-          <w:spacing w:val="-10"/>
-          <w:kern w:val="28"/>
-          <w:sz w:val="32"/>
-          <w:szCs w:val="32"/>
-        </w:rPr>
-        <w:t>(AUTONOMOUS)</w:t>
-      </w:r>
+    </w:p>
+    <w:p>
+      <w:pPr>
+        <w:spacing w:before="120" w:after="120" w:line="360" w:lineRule="auto"/>
+        <w:jc w:val="center"/>
+        <w:rPr>
+          <w:rFonts w:ascii="Times New Roman" w:hAnsi="Times New Roman" w:cs="Times New Roman"/>
+          <w:b/>
+          <w:bCs/>
+          <w:sz w:val="44"/>
+          <w:szCs w:val="44"/>
+        </w:rPr>
+      </w:pPr>
     </w:p>
     <w:p>
       <w:pPr>
@@ -557,7 +43,46 @@
     </w:p>
     <w:p>
       <w:pPr>
-        <w:spacing w:after="79" w:line="360" w:lineRule="auto"/>
+        <w:spacing w:before="120" w:after="120" w:line="360" w:lineRule="auto"/>
+        <w:jc w:val="center"/>
+        <w:rPr>
+          <w:rFonts w:ascii="Times New Roman" w:hAnsi="Times New Roman" w:cs="Times New Roman"/>
+          <w:sz w:val="56"/>
+          <w:szCs w:val="56"/>
+        </w:rPr>
+      </w:pPr>
+      <w:r>
+        <w:rPr>
+          <w:rFonts w:ascii="Times New Roman" w:hAnsi="Times New Roman" w:cs="Times New Roman"/>
+          <w:b/>
+          <w:bCs/>
+          <w:sz w:val="56"/>
+          <w:szCs w:val="56"/>
+        </w:rPr>
+        <w:t>Secure Over-The-Air (OTA) Firmware Update</w:t>
+      </w:r>
+      <w:r>
+        <w:rPr>
+          <w:rFonts w:ascii="Times New Roman" w:hAnsi="Times New Roman" w:cs="Times New Roman"/>
+          <w:sz w:val="56"/>
+          <w:szCs w:val="56"/>
+        </w:rPr>
+        <w:t xml:space="preserve"> </w:t>
+      </w:r>
+      <w:r>
+        <w:rPr>
+          <w:rFonts w:ascii="Times New Roman" w:hAnsi="Times New Roman" w:cs="Times New Roman"/>
+          <w:b/>
+          <w:bCs/>
+          <w:sz w:val="56"/>
+          <w:szCs w:val="56"/>
+        </w:rPr>
+        <w:t>Mechanism for IoT Devices</w:t>
+      </w:r>
+    </w:p>
+    <w:p>
+      <w:pPr>
+        <w:spacing w:before="240" w:after="80" w:line="360" w:lineRule="auto"/>
         <w:jc w:val="center"/>
         <w:rPr>
           <w:rFonts w:ascii="Times New Roman" w:hAnsi="Times New Roman" w:cs="Times New Roman"/>
@@ -569,302 +94,31 @@
           <w:sz w:val="26"/>
           <w:szCs w:val="26"/>
         </w:rPr>
-        <w:br w:type="page"/>
-      </w:r>
-      <w:r>
-        <w:rPr>
-          <w:rFonts w:ascii="Times New Roman" w:hAnsi="Times New Roman" w:cs="Times New Roman"/>
-          <w:noProof/>
-          <w:lang w:val="en-US" w:eastAsia="en-US"/>
-        </w:rPr>
-        <w:lastRenderedPageBreak/>
-        <w:drawing>
-          <wp:inline distT="0" distB="0" distL="0" distR="0" wp14:anchorId="2160EC35" wp14:editId="1E526F58">
-            <wp:extent cx="2968153" cy="1012371"/>
-            <wp:effectExtent l="0" t="0" r="3810" b="0"/>
-            <wp:docPr id="166" name="Picture 166"/>
-            <wp:cNvGraphicFramePr/>
-            <a:graphic xmlns:a="http://schemas.openxmlformats.org/drawingml/2006/main">
-              <a:graphicData uri="http://schemas.openxmlformats.org/drawingml/2006/picture">
-                <pic:pic xmlns:pic="http://schemas.openxmlformats.org/drawingml/2006/picture">
-                  <pic:nvPicPr>
-                    <pic:cNvPr id="166" name="Picture 166"/>
-                    <pic:cNvPicPr/>
-                  </pic:nvPicPr>
-                  <pic:blipFill>
-                    <a:blip r:embed="rId9"/>
-                    <a:stretch>
-                      <a:fillRect/>
-                    </a:stretch>
-                  </pic:blipFill>
-                  <pic:spPr>
-                    <a:xfrm>
-                      <a:off x="0" y="0"/>
-                      <a:ext cx="2980900" cy="1016719"/>
-                    </a:xfrm>
-                    <a:prstGeom prst="rect">
-                      <a:avLst/>
-                    </a:prstGeom>
-                  </pic:spPr>
-                </pic:pic>
-              </a:graphicData>
-            </a:graphic>
-          </wp:inline>
-        </w:drawing>
-      </w:r>
-    </w:p>
-    <w:p>
-      <w:pPr>
+        <w:t>With Encrypted Delivery Channel, Firmware Version Tracking,</w:t>
+      </w:r>
+    </w:p>
+    <w:p>
+      <w:pPr>
+        <w:spacing w:before="40" w:after="240" w:line="360" w:lineRule="auto"/>
         <w:jc w:val="center"/>
         <w:rPr>
           <w:rFonts w:ascii="Times New Roman" w:hAnsi="Times New Roman" w:cs="Times New Roman"/>
-          <w:b/>
-          <w:bCs/>
-        </w:rPr>
-      </w:pPr>
-      <w:r>
-        <w:rPr>
-          <w:rFonts w:ascii="Times New Roman" w:hAnsi="Times New Roman" w:cs="Times New Roman"/>
-          <w:b/>
-          <w:bCs/>
-        </w:rPr>
-        <w:t>REG. NO : 912312803</w:t>
-      </w:r>
-      <w:r>
-        <w:rPr>
-          <w:rFonts w:ascii="Times New Roman" w:hAnsi="Times New Roman" w:cs="Times New Roman"/>
-          <w:b/>
-          <w:bCs/>
-        </w:rPr>
-        <w:t>9</w:t>
-      </w:r>
-      <w:r>
-        <w:rPr>
-          <w:rFonts w:ascii="Times New Roman" w:hAnsi="Times New Roman" w:cs="Times New Roman"/>
-          <w:b/>
-          <w:bCs/>
-        </w:rPr>
-        <w:t>,9123128040,9123128034</w:t>
-      </w:r>
-    </w:p>
-    <w:p>
-      <w:pPr>
-        <w:spacing w:after="79" w:line="360" w:lineRule="auto"/>
-        <w:ind w:left="541"/>
-        <w:jc w:val="center"/>
-        <w:rPr>
-          <w:rFonts w:ascii="Times New Roman" w:hAnsi="Times New Roman" w:cs="Times New Roman"/>
-        </w:rPr>
-      </w:pPr>
-    </w:p>
-    <w:p>
-      <w:pPr>
-        <w:spacing w:line="360" w:lineRule="auto"/>
-        <w:rPr>
-          <w:rFonts w:ascii="Times New Roman" w:hAnsi="Times New Roman" w:cs="Times New Roman"/>
-          <w:b/>
-          <w:bCs/>
-        </w:rPr>
-      </w:pPr>
-      <w:r>
-        <w:rPr>
-          <w:rFonts w:ascii="Times New Roman" w:hAnsi="Times New Roman" w:cs="Times New Roman"/>
-          <w:b/>
-          <w:bCs/>
-        </w:rPr>
-        <w:t xml:space="preserve">Name of the Course : </w:t>
-      </w:r>
-      <w:r>
-        <w:rPr>
-          <w:rFonts w:ascii="Times New Roman" w:hAnsi="Times New Roman" w:cs="Times New Roman"/>
-          <w:b/>
-          <w:bCs/>
-        </w:rPr>
-        <w:t>PROJECT REPORT</w:t>
-      </w:r>
-    </w:p>
-    <w:p>
-      <w:pPr>
-        <w:spacing w:line="360" w:lineRule="auto"/>
-        <w:rPr>
-          <w:rFonts w:ascii="Times New Roman" w:hAnsi="Times New Roman" w:cs="Times New Roman"/>
-        </w:rPr>
-      </w:pPr>
-    </w:p>
-    <w:p>
-      <w:pPr>
-        <w:spacing w:line="360" w:lineRule="auto"/>
-        <w:jc w:val="both"/>
-        <w:rPr>
-          <w:rFonts w:ascii="Times New Roman" w:hAnsi="Times New Roman" w:cs="Times New Roman"/>
-        </w:rPr>
-      </w:pPr>
-      <w:r>
-        <w:rPr>
-          <w:rFonts w:ascii="Times New Roman" w:hAnsi="Times New Roman" w:cs="Times New Roman"/>
-        </w:rPr>
-        <w:t xml:space="preserve">It  is to certify that this is a Bonafide record of the work carried out by </w:t>
-      </w:r>
-      <w:r>
-        <w:rPr>
-          <w:rFonts w:ascii="Times New Roman" w:hAnsi="Times New Roman" w:cs="Times New Roman"/>
-        </w:rPr>
-        <w:t xml:space="preserve">Ritesh V </w:t>
-      </w:r>
-      <w:r>
-        <w:rPr>
-          <w:rFonts w:ascii="Times New Roman" w:hAnsi="Times New Roman" w:cs="Times New Roman"/>
-        </w:rPr>
-        <w:t>(91231280</w:t>
-      </w:r>
-      <w:r>
-        <w:rPr>
-          <w:rFonts w:ascii="Times New Roman" w:hAnsi="Times New Roman" w:cs="Times New Roman"/>
-        </w:rPr>
-        <w:t>39</w:t>
-      </w:r>
-      <w:r>
-        <w:rPr>
-          <w:rFonts w:ascii="Times New Roman" w:hAnsi="Times New Roman" w:cs="Times New Roman"/>
-        </w:rPr>
-        <w:t xml:space="preserve">) </w:t>
-      </w:r>
-      <w:r>
-        <w:rPr>
-          <w:rFonts w:ascii="Times New Roman" w:hAnsi="Times New Roman" w:cs="Times New Roman"/>
-        </w:rPr>
-        <w:t xml:space="preserve">, Rithik Sharma A (9123128040) Priyanka Devi S (9123128034) </w:t>
-      </w:r>
-      <w:r>
-        <w:rPr>
-          <w:rFonts w:ascii="Times New Roman" w:hAnsi="Times New Roman" w:cs="Times New Roman"/>
-        </w:rPr>
-        <w:t xml:space="preserve">of  VI  </w:t>
-      </w:r>
-      <w:r>
-        <w:rPr>
-          <w:rFonts w:ascii="Times New Roman" w:hAnsi="Times New Roman" w:cs="Times New Roman"/>
-        </w:rPr>
-        <w:t>S</w:t>
-      </w:r>
-      <w:r>
-        <w:rPr>
-          <w:rFonts w:ascii="Times New Roman" w:hAnsi="Times New Roman" w:cs="Times New Roman"/>
-        </w:rPr>
-        <w:t xml:space="preserve">emester CSE – CYBER SECURITY </w:t>
-      </w:r>
-      <w:r>
-        <w:rPr>
-          <w:rFonts w:ascii="Times New Roman" w:hAnsi="Times New Roman" w:cs="Times New Roman"/>
-        </w:rPr>
-        <w:t>D</w:t>
-      </w:r>
-      <w:r>
-        <w:rPr>
-          <w:rFonts w:ascii="Times New Roman" w:hAnsi="Times New Roman" w:cs="Times New Roman"/>
-        </w:rPr>
-        <w:t>epartment , during the even semester of the academic year 2025 - 2026</w:t>
-      </w:r>
-    </w:p>
-    <w:p>
-      <w:pPr>
-        <w:spacing w:line="360" w:lineRule="auto"/>
-        <w:rPr>
-          <w:rFonts w:ascii="Times New Roman" w:hAnsi="Times New Roman" w:cs="Times New Roman"/>
-        </w:rPr>
-      </w:pPr>
-      <w:r>
-        <w:rPr>
-          <w:rFonts w:ascii="Times New Roman" w:hAnsi="Times New Roman" w:cs="Times New Roman"/>
-        </w:rPr>
-        <w:t xml:space="preserve"> </w:t>
-      </w:r>
-    </w:p>
-    <w:p>
-      <w:pPr>
-        <w:spacing w:line="360" w:lineRule="auto"/>
-        <w:rPr>
-          <w:rFonts w:ascii="Times New Roman" w:hAnsi="Times New Roman" w:cs="Times New Roman"/>
-        </w:rPr>
-      </w:pPr>
-    </w:p>
-    <w:p>
-      <w:pPr>
-        <w:spacing w:line="480" w:lineRule="auto"/>
-        <w:rPr>
-          <w:rFonts w:ascii="Times New Roman" w:hAnsi="Times New Roman" w:cs="Times New Roman"/>
-          <w:b/>
-          <w:bCs/>
-        </w:rPr>
-      </w:pPr>
-      <w:r>
-        <w:rPr>
-          <w:rFonts w:ascii="Times New Roman" w:hAnsi="Times New Roman" w:cs="Times New Roman"/>
-          <w:b/>
-          <w:bCs/>
-        </w:rPr>
-        <w:t>Faculty In-Charge : ……………………….                      HOD : ………………………………</w:t>
-      </w:r>
-    </w:p>
-    <w:p>
-      <w:pPr>
-        <w:spacing w:line="480" w:lineRule="auto"/>
-        <w:rPr>
-          <w:rFonts w:ascii="Times New Roman" w:hAnsi="Times New Roman" w:cs="Times New Roman"/>
-          <w:b/>
-          <w:bCs/>
-        </w:rPr>
-      </w:pPr>
-    </w:p>
-    <w:p>
-      <w:pPr>
-        <w:spacing w:line="480" w:lineRule="auto"/>
-        <w:rPr>
-          <w:rFonts w:ascii="Times New Roman" w:hAnsi="Times New Roman" w:cs="Times New Roman"/>
-          <w:b/>
-          <w:bCs/>
-        </w:rPr>
-      </w:pPr>
-      <w:r>
-        <w:rPr>
-          <w:rFonts w:ascii="Times New Roman" w:hAnsi="Times New Roman" w:cs="Times New Roman"/>
-          <w:b/>
-          <w:bCs/>
-        </w:rPr>
-        <w:t xml:space="preserve">INTERNAL EXAMINER: ……………     </w:t>
-      </w:r>
-    </w:p>
-    <w:p>
-      <w:pPr>
-        <w:spacing w:line="480" w:lineRule="auto"/>
-        <w:rPr>
-          <w:rFonts w:ascii="Times New Roman" w:hAnsi="Times New Roman" w:cs="Times New Roman"/>
-          <w:b/>
-          <w:bCs/>
-        </w:rPr>
-      </w:pPr>
-    </w:p>
-    <w:p>
-      <w:pPr>
-        <w:spacing w:line="480" w:lineRule="auto"/>
-        <w:rPr>
-          <w:rFonts w:ascii="Times New Roman" w:hAnsi="Times New Roman" w:cs="Times New Roman"/>
-          <w:b/>
-          <w:bCs/>
-        </w:rPr>
-      </w:pPr>
-      <w:r>
-        <w:rPr>
-          <w:rFonts w:ascii="Times New Roman" w:hAnsi="Times New Roman" w:cs="Times New Roman"/>
-          <w:b/>
-          <w:bCs/>
-        </w:rPr>
-        <w:t xml:space="preserve"> DATE OF EXAMNINATION : …………………………</w:t>
-      </w:r>
-    </w:p>
-    <w:p>
-      <w:pPr>
-        <w:spacing w:after="160" w:line="278" w:lineRule="auto"/>
+          <w:sz w:val="26"/>
+          <w:szCs w:val="26"/>
+        </w:rPr>
+      </w:pPr>
+      <w:r>
+        <w:rPr>
+          <w:rFonts w:ascii="Times New Roman" w:hAnsi="Times New Roman" w:cs="Times New Roman"/>
+          <w:sz w:val="26"/>
+          <w:szCs w:val="26"/>
+        </w:rPr>
+        <w:t>and Update Relevance Assessment Dashboard</w:t>
+      </w:r>
+    </w:p>
+    <w:p>
+      <w:pPr>
+        <w:spacing w:after="160" w:line="360" w:lineRule="auto"/>
         <w:rPr>
           <w:rFonts w:ascii="Times New Roman" w:hAnsi="Times New Roman" w:cs="Times New Roman"/>
           <w:sz w:val="26"/>
@@ -898,6 +152,7 @@
           <w:szCs w:val="40"/>
         </w:rPr>
       </w:pPr>
+      <w:proofErr w:type="gramStart"/>
       <w:r>
         <w:rPr>
           <w:rFonts w:ascii="Times New Roman" w:hAnsi="Times New Roman" w:cs="Times New Roman"/>
@@ -930,7 +185,19 @@
           <w:sz w:val="40"/>
           <w:szCs w:val="40"/>
         </w:rPr>
-        <w:t>tive  and Scope</w:t>
+        <w:t>tive  and</w:t>
+      </w:r>
+      <w:proofErr w:type="gramEnd"/>
+      <w:r>
+        <w:rPr>
+          <w:rFonts w:ascii="Times New Roman" w:hAnsi="Times New Roman" w:cs="Times New Roman"/>
+          <w:b/>
+          <w:bCs/>
+          <w:color w:val="auto"/>
+          <w:sz w:val="40"/>
+          <w:szCs w:val="40"/>
+        </w:rPr>
+        <w:t xml:space="preserve"> Scope</w:t>
       </w:r>
     </w:p>
     <w:p>
@@ -5801,6 +5068,7 @@
         <w:t xml:space="preserve">This is a new TypeScript/Node.js module integrated into the IDE's upload pipeline. It intercepts the upload command when a Network Port is selected (instead of a COM/USB port) and executes the secure upload sequence. It exposes a single asynchronous function: </w:t>
       </w:r>
       <w:proofErr w:type="spellStart"/>
+      <w:proofErr w:type="gramStart"/>
       <w:r>
         <w:rPr>
           <w:rFonts w:ascii="Times New Roman" w:hAnsi="Times New Roman" w:cs="Times New Roman"/>
@@ -5815,6 +5083,7 @@
         <w:t>(</w:t>
       </w:r>
       <w:proofErr w:type="spellStart"/>
+      <w:proofErr w:type="gramEnd"/>
       <w:r>
         <w:rPr>
           <w:rFonts w:ascii="Times New Roman" w:hAnsi="Times New Roman" w:cs="Times New Roman"/>
@@ -5894,6 +5163,7 @@
         <w:t xml:space="preserve">Session key generation: A fresh AES-256 key and 128-bit IV are generated per upload using Node.js </w:t>
       </w:r>
       <w:proofErr w:type="spellStart"/>
+      <w:proofErr w:type="gramStart"/>
       <w:r>
         <w:rPr>
           <w:rFonts w:ascii="Times New Roman" w:hAnsi="Times New Roman" w:cs="Times New Roman"/>
@@ -5901,6 +5171,7 @@
         <w:t>crypto.randomBytes</w:t>
       </w:r>
       <w:proofErr w:type="spellEnd"/>
+      <w:proofErr w:type="gramEnd"/>
       <w:r>
         <w:rPr>
           <w:rFonts w:ascii="Times New Roman" w:hAnsi="Times New Roman" w:cs="Times New Roman"/>
@@ -6475,6 +5746,7 @@
         <w:t>-capable devices on the local network using mDNS queries (the same service discovery used by standard Arduino OTA, _</w:t>
       </w:r>
       <w:proofErr w:type="spellStart"/>
+      <w:proofErr w:type="gramStart"/>
       <w:r>
         <w:rPr>
           <w:rFonts w:ascii="Times New Roman" w:hAnsi="Times New Roman" w:cs="Times New Roman"/>
@@ -6489,6 +5761,7 @@
         <w:t>._</w:t>
       </w:r>
       <w:proofErr w:type="spellStart"/>
+      <w:proofErr w:type="gramEnd"/>
       <w:r>
         <w:rPr>
           <w:rFonts w:ascii="Times New Roman" w:hAnsi="Times New Roman" w:cs="Times New Roman"/>
@@ -6677,9 +5950,38 @@
         <w:rPr>
           <w:rFonts w:ascii="Times New Roman" w:hAnsi="Times New Roman" w:cs="Times New Roman"/>
         </w:rPr>
-        <w:t xml:space="preserve"> in their sketch, with identical API calls (begin(), handle(), </w:t>
+        <w:t xml:space="preserve"> in their sketch, with identical API calls (</w:t>
+      </w:r>
+      <w:proofErr w:type="gramStart"/>
+      <w:r>
+        <w:rPr>
+          <w:rFonts w:ascii="Times New Roman" w:hAnsi="Times New Roman" w:cs="Times New Roman"/>
+        </w:rPr>
+        <w:t>begin(</w:t>
+      </w:r>
+      <w:proofErr w:type="gramEnd"/>
+      <w:r>
+        <w:rPr>
+          <w:rFonts w:ascii="Times New Roman" w:hAnsi="Times New Roman" w:cs="Times New Roman"/>
+        </w:rPr>
+        <w:t xml:space="preserve">), </w:t>
+      </w:r>
+      <w:proofErr w:type="gramStart"/>
+      <w:r>
+        <w:rPr>
+          <w:rFonts w:ascii="Times New Roman" w:hAnsi="Times New Roman" w:cs="Times New Roman"/>
+        </w:rPr>
+        <w:t>handle(</w:t>
+      </w:r>
+      <w:proofErr w:type="gramEnd"/>
+      <w:r>
+        <w:rPr>
+          <w:rFonts w:ascii="Times New Roman" w:hAnsi="Times New Roman" w:cs="Times New Roman"/>
+        </w:rPr>
+        <w:t xml:space="preserve">), </w:t>
       </w:r>
       <w:proofErr w:type="spellStart"/>
+      <w:proofErr w:type="gramStart"/>
       <w:r>
         <w:rPr>
           <w:rFonts w:ascii="Times New Roman" w:hAnsi="Times New Roman" w:cs="Times New Roman"/>
@@ -6691,9 +5993,17 @@
         <w:rPr>
           <w:rFonts w:ascii="Times New Roman" w:hAnsi="Times New Roman" w:cs="Times New Roman"/>
         </w:rPr>
-        <w:t xml:space="preserve">() replaced by </w:t>
+        <w:t>(</w:t>
+      </w:r>
+      <w:proofErr w:type="gramEnd"/>
+      <w:r>
+        <w:rPr>
+          <w:rFonts w:ascii="Times New Roman" w:hAnsi="Times New Roman" w:cs="Times New Roman"/>
+        </w:rPr>
+        <w:t xml:space="preserve">) replaced by </w:t>
       </w:r>
       <w:proofErr w:type="spellStart"/>
+      <w:proofErr w:type="gramStart"/>
       <w:r>
         <w:rPr>
           <w:rFonts w:ascii="Times New Roman" w:hAnsi="Times New Roman" w:cs="Times New Roman"/>
@@ -6705,7 +6015,14 @@
         <w:rPr>
           <w:rFonts w:ascii="Times New Roman" w:hAnsi="Times New Roman" w:cs="Times New Roman"/>
         </w:rPr>
-        <w:t>()).</w:t>
+        <w:t>(</w:t>
+      </w:r>
+      <w:proofErr w:type="gramEnd"/>
+      <w:r>
+        <w:rPr>
+          <w:rFonts w:ascii="Times New Roman" w:hAnsi="Times New Roman" w:cs="Times New Roman"/>
+        </w:rPr>
+        <w:t>)).</w:t>
       </w:r>
     </w:p>
     <w:p>
@@ -7471,7 +6788,6 @@
       <w:r>
         <w:rPr>
           <w:rFonts w:ascii="Times New Roman" w:hAnsi="Times New Roman" w:cs="Times New Roman"/>
-          <w:noProof/>
         </w:rPr>
         <w:drawing>
           <wp:inline distT="0" distB="0" distL="0" distR="0" wp14:anchorId="656B119A" wp14:editId="21979AC7">
@@ -7489,7 +6805,7 @@
                     <pic:cNvPicPr/>
                   </pic:nvPicPr>
                   <pic:blipFill>
-                    <a:blip r:embed="rId10"/>
+                    <a:blip r:embed="rId8"/>
                     <a:stretch>
                       <a:fillRect/>
                     </a:stretch>
@@ -7664,7 +6980,6 @@
       <w:r>
         <w:rPr>
           <w:rFonts w:ascii="Times New Roman" w:hAnsi="Times New Roman" w:cs="Times New Roman"/>
-          <w:noProof/>
         </w:rPr>
         <w:drawing>
           <wp:inline distT="0" distB="0" distL="0" distR="0" wp14:anchorId="7E19D142" wp14:editId="269449BD">
@@ -7682,7 +6997,7 @@
                     <pic:cNvPicPr/>
                   </pic:nvPicPr>
                   <pic:blipFill>
-                    <a:blip r:embed="rId11"/>
+                    <a:blip r:embed="rId9"/>
                     <a:stretch>
                       <a:fillRect/>
                     </a:stretch>
@@ -8253,7 +7568,21 @@
               <w:rPr>
                 <w:rFonts w:ascii="Times New Roman" w:hAnsi="Times New Roman" w:cs="Times New Roman"/>
               </w:rPr>
-              <w:t xml:space="preserve"> (ESP32 hardware-accelerated): ECDH session key decryption, AES-256-CBC firmware decryption, SHA-256 hash verify, ECDSA signature verify.</w:t>
+              <w:t xml:space="preserve"> (ESP32 hardware-accelerated): ECDH session key decryption, AES-256-CBC firmware decryption, SHA-256 hash </w:t>
+            </w:r>
+            <w:proofErr w:type="gramStart"/>
+            <w:r>
+              <w:rPr>
+                <w:rFonts w:ascii="Times New Roman" w:hAnsi="Times New Roman" w:cs="Times New Roman"/>
+              </w:rPr>
+              <w:t>verify</w:t>
+            </w:r>
+            <w:proofErr w:type="gramEnd"/>
+            <w:r>
+              <w:rPr>
+                <w:rFonts w:ascii="Times New Roman" w:hAnsi="Times New Roman" w:cs="Times New Roman"/>
+              </w:rPr>
+              <w:t>, ECDSA signature verify.</w:t>
             </w:r>
           </w:p>
         </w:tc>
@@ -8510,6 +7839,7 @@
               <w:t>Devices advertise _</w:t>
             </w:r>
             <w:proofErr w:type="spellStart"/>
+            <w:proofErr w:type="gramStart"/>
             <w:r>
               <w:rPr>
                 <w:rFonts w:ascii="Times New Roman" w:hAnsi="Times New Roman" w:cs="Times New Roman"/>
@@ -8524,6 +7854,7 @@
               <w:t>._</w:t>
             </w:r>
             <w:proofErr w:type="spellStart"/>
+            <w:proofErr w:type="gramEnd"/>
             <w:r>
               <w:rPr>
                 <w:rFonts w:ascii="Times New Roman" w:hAnsi="Times New Roman" w:cs="Times New Roman"/>
@@ -13470,37 +12801,25 @@
         <w:rPr>
           <w:rFonts w:ascii="Times New Roman" w:hAnsi="Times New Roman" w:cs="Times New Roman"/>
         </w:rPr>
-        <w:t xml:space="preserve">Handles </w:t>
+        <w:t>Handles mDNS advertisement (_</w:t>
       </w:r>
       <w:proofErr w:type="spellStart"/>
-      <w:r>
-        <w:rPr>
-          <w:rFonts w:ascii="Times New Roman" w:hAnsi="Times New Roman" w:cs="Times New Roman"/>
-        </w:rPr>
-        <w:t>mDNS</w:t>
+      <w:proofErr w:type="gramStart"/>
+      <w:r>
+        <w:rPr>
+          <w:rFonts w:ascii="Times New Roman" w:hAnsi="Times New Roman" w:cs="Times New Roman"/>
+        </w:rPr>
+        <w:t>arduino</w:t>
       </w:r>
       <w:proofErr w:type="spellEnd"/>
       <w:r>
         <w:rPr>
           <w:rFonts w:ascii="Times New Roman" w:hAnsi="Times New Roman" w:cs="Times New Roman"/>
         </w:rPr>
-        <w:t xml:space="preserve"> advertisement (_</w:t>
+        <w:t>._</w:t>
       </w:r>
       <w:proofErr w:type="spellStart"/>
-      <w:r>
-        <w:rPr>
-          <w:rFonts w:ascii="Times New Roman" w:hAnsi="Times New Roman" w:cs="Times New Roman"/>
-        </w:rPr>
-        <w:t>arduino</w:t>
-      </w:r>
-      <w:proofErr w:type="spellEnd"/>
-      <w:r>
-        <w:rPr>
-          <w:rFonts w:ascii="Times New Roman" w:hAnsi="Times New Roman" w:cs="Times New Roman"/>
-        </w:rPr>
-        <w:t>._</w:t>
-      </w:r>
-      <w:proofErr w:type="spellStart"/>
+      <w:proofErr w:type="gramEnd"/>
       <w:r>
         <w:rPr>
           <w:rFonts w:ascii="Times New Roman" w:hAnsi="Times New Roman" w:cs="Times New Roman"/>
@@ -14270,7 +13589,35 @@
         <w:rPr>
           <w:rFonts w:ascii="Times New Roman" w:hAnsi="Times New Roman" w:cs="Times New Roman"/>
         </w:rPr>
-        <w:t xml:space="preserve"> library — same API (begin(), handle()), same sketch include pattern (</w:t>
+        <w:t xml:space="preserve"> library — same API (</w:t>
+      </w:r>
+      <w:proofErr w:type="gramStart"/>
+      <w:r>
+        <w:rPr>
+          <w:rFonts w:ascii="Times New Roman" w:hAnsi="Times New Roman" w:cs="Times New Roman"/>
+        </w:rPr>
+        <w:t>begin(</w:t>
+      </w:r>
+      <w:proofErr w:type="gramEnd"/>
+      <w:r>
+        <w:rPr>
+          <w:rFonts w:ascii="Times New Roman" w:hAnsi="Times New Roman" w:cs="Times New Roman"/>
+        </w:rPr>
+        <w:t xml:space="preserve">), </w:t>
+      </w:r>
+      <w:proofErr w:type="gramStart"/>
+      <w:r>
+        <w:rPr>
+          <w:rFonts w:ascii="Times New Roman" w:hAnsi="Times New Roman" w:cs="Times New Roman"/>
+        </w:rPr>
+        <w:t>handle(</w:t>
+      </w:r>
+      <w:proofErr w:type="gramEnd"/>
+      <w:r>
+        <w:rPr>
+          <w:rFonts w:ascii="Times New Roman" w:hAnsi="Times New Roman" w:cs="Times New Roman"/>
+        </w:rPr>
+        <w:t>)), same sketch include pattern (</w:t>
       </w:r>
       <w:proofErr w:type="spellStart"/>
       <w:r>
@@ -14306,6 +13653,7 @@
         <w:t>Advertises _</w:t>
       </w:r>
       <w:proofErr w:type="spellStart"/>
+      <w:proofErr w:type="gramStart"/>
       <w:r>
         <w:rPr>
           <w:rFonts w:ascii="Times New Roman" w:hAnsi="Times New Roman" w:cs="Times New Roman"/>
@@ -14320,6 +13668,7 @@
         <w:t>._</w:t>
       </w:r>
       <w:proofErr w:type="spellStart"/>
+      <w:proofErr w:type="gramEnd"/>
       <w:r>
         <w:rPr>
           <w:rFonts w:ascii="Times New Roman" w:hAnsi="Times New Roman" w:cs="Times New Roman"/>
@@ -14331,21 +13680,7 @@
         <w:rPr>
           <w:rFonts w:ascii="Times New Roman" w:hAnsi="Times New Roman" w:cs="Times New Roman"/>
         </w:rPr>
-        <w:t xml:space="preserve"> </w:t>
-      </w:r>
-      <w:proofErr w:type="spellStart"/>
-      <w:r>
-        <w:rPr>
-          <w:rFonts w:ascii="Times New Roman" w:hAnsi="Times New Roman" w:cs="Times New Roman"/>
-        </w:rPr>
-        <w:t>mDNS</w:t>
-      </w:r>
-      <w:proofErr w:type="spellEnd"/>
-      <w:r>
-        <w:rPr>
-          <w:rFonts w:ascii="Times New Roman" w:hAnsi="Times New Roman" w:cs="Times New Roman"/>
-        </w:rPr>
-        <w:t xml:space="preserve"> with additional TXT record: </w:t>
+        <w:t xml:space="preserve"> mDNS with additional TXT record: </w:t>
       </w:r>
       <w:proofErr w:type="spellStart"/>
       <w:r>
@@ -14475,14 +13810,28 @@
         <w:rPr>
           <w:rFonts w:ascii="Times New Roman" w:hAnsi="Times New Roman" w:cs="Times New Roman"/>
         </w:rPr>
-        <w:t>esp_ota_set_boot_partition</w:t>
+        <w:t>esp_ota_set_boot_</w:t>
+      </w:r>
+      <w:proofErr w:type="gramStart"/>
+      <w:r>
+        <w:rPr>
+          <w:rFonts w:ascii="Times New Roman" w:hAnsi="Times New Roman" w:cs="Times New Roman"/>
+        </w:rPr>
+        <w:t>partition</w:t>
       </w:r>
       <w:proofErr w:type="spellEnd"/>
       <w:r>
         <w:rPr>
           <w:rFonts w:ascii="Times New Roman" w:hAnsi="Times New Roman" w:cs="Times New Roman"/>
         </w:rPr>
-        <w:t>(), triggers restart.</w:t>
+        <w:t>(</w:t>
+      </w:r>
+      <w:proofErr w:type="gramEnd"/>
+      <w:r>
+        <w:rPr>
+          <w:rFonts w:ascii="Times New Roman" w:hAnsi="Times New Roman" w:cs="Times New Roman"/>
+        </w:rPr>
+        <w:t>), triggers restart.</w:t>
       </w:r>
     </w:p>
     <w:p>
@@ -16349,14 +15698,28 @@
               <w:rPr>
                 <w:rFonts w:ascii="Times New Roman" w:hAnsi="Times New Roman" w:cs="Times New Roman"/>
               </w:rPr>
-              <w:t>esp_ota_set_boot_partition</w:t>
+              <w:t>esp_ota_set_boot_</w:t>
+            </w:r>
+            <w:proofErr w:type="gramStart"/>
+            <w:r>
+              <w:rPr>
+                <w:rFonts w:ascii="Times New Roman" w:hAnsi="Times New Roman" w:cs="Times New Roman"/>
+              </w:rPr>
+              <w:t>partition</w:t>
             </w:r>
             <w:proofErr w:type="spellEnd"/>
             <w:r>
               <w:rPr>
                 <w:rFonts w:ascii="Times New Roman" w:hAnsi="Times New Roman" w:cs="Times New Roman"/>
               </w:rPr>
-              <w:t>() not called; NACK sent to IDE</w:t>
+              <w:t>(</w:t>
+            </w:r>
+            <w:proofErr w:type="gramEnd"/>
+            <w:r>
+              <w:rPr>
+                <w:rFonts w:ascii="Times New Roman" w:hAnsi="Times New Roman" w:cs="Times New Roman"/>
+              </w:rPr>
+              <w:t>) not called; NACK sent to IDE</w:t>
             </w:r>
           </w:p>
         </w:tc>
@@ -18171,7 +17534,21 @@
               <w:rPr>
                 <w:rFonts w:ascii="Times New Roman" w:hAnsi="Times New Roman" w:cs="Times New Roman"/>
               </w:rPr>
-              <w:t>Device decrypts correctly but computed hash != transmitted hash; update aborted</w:t>
+              <w:t xml:space="preserve">Device decrypts correctly but computed </w:t>
+            </w:r>
+            <w:proofErr w:type="gramStart"/>
+            <w:r>
+              <w:rPr>
+                <w:rFonts w:ascii="Times New Roman" w:hAnsi="Times New Roman" w:cs="Times New Roman"/>
+              </w:rPr>
+              <w:t>hash !</w:t>
+            </w:r>
+            <w:proofErr w:type="gramEnd"/>
+            <w:r>
+              <w:rPr>
+                <w:rFonts w:ascii="Times New Roman" w:hAnsi="Times New Roman" w:cs="Times New Roman"/>
+              </w:rPr>
+              <w:t>= transmitted hash; update aborted</w:t>
             </w:r>
           </w:p>
         </w:tc>
@@ -18711,14 +18088,28 @@
               <w:rPr>
                 <w:rFonts w:ascii="Times New Roman" w:hAnsi="Times New Roman" w:cs="Times New Roman"/>
               </w:rPr>
-              <w:t>app_main</w:t>
+              <w:t>app_</w:t>
+            </w:r>
+            <w:proofErr w:type="gramStart"/>
+            <w:r>
+              <w:rPr>
+                <w:rFonts w:ascii="Times New Roman" w:hAnsi="Times New Roman" w:cs="Times New Roman"/>
+              </w:rPr>
+              <w:t>main</w:t>
             </w:r>
             <w:proofErr w:type="spellEnd"/>
             <w:r>
               <w:rPr>
                 <w:rFonts w:ascii="Times New Roman" w:hAnsi="Times New Roman" w:cs="Times New Roman"/>
               </w:rPr>
-              <w:t>() within watchdog window; ESP-IDF OTA manager rolls back to previous partition</w:t>
+              <w:t>(</w:t>
+            </w:r>
+            <w:proofErr w:type="gramEnd"/>
+            <w:r>
+              <w:rPr>
+                <w:rFonts w:ascii="Times New Roman" w:hAnsi="Times New Roman" w:cs="Times New Roman"/>
+              </w:rPr>
+              <w:t>) within watchdog window; ESP-IDF OTA manager rolls back to previous partition</w:t>
             </w:r>
           </w:p>
         </w:tc>
@@ -20258,7 +19649,7 @@
       </w:r>
     </w:p>
     <w:sectPr>
-      <w:footerReference w:type="default" r:id="rId12"/>
+      <w:footerReference w:type="default" r:id="rId10"/>
       <w:pgSz w:w="11906" w:h="16838"/>
       <w:pgMar w:top="1440" w:right="1440" w:bottom="1440" w:left="1440" w:header="708" w:footer="708" w:gutter="0"/>
       <w:pgBorders w:offsetFrom="page">

</xml_diff>